<commit_message>
create pdf from invoice result
</commit_message>
<xml_diff>
--- a/InvoiceLib_Handover_Guide.docx
+++ b/InvoiceLib_Handover_Guide.docx
@@ -2453,16 +2453,7 @@
           <w:sz w:val="40"/>
           <w:szCs w:val="40"/>
         </w:rPr>
-        <w:t xml:space="preserve">10. </w:t>
-      </w:r>
-      <w:r>
-        <w:rPr>
-          <w:rFonts w:asciiTheme="majorHAnsi" w:hAnsiTheme="majorHAnsi"/>
-          <w:color w:val="156082" w:themeColor="accent1"/>
-          <w:sz w:val="40"/>
-          <w:szCs w:val="40"/>
-        </w:rPr>
-        <w:t>Xuất hóa đơn thành CSV</w:t>
+        <w:t>10. Xuất hóa đơn thành CSV</w:t>
       </w:r>
     </w:p>
     <w:p>
@@ -3062,14 +3053,420 @@
     </w:p>
     <w:p>
       <w:pPr>
+        <w:pStyle w:val="ListBullet"/>
+        <w:numPr>
+          <w:ilvl w:val="0"/>
+          <w:numId w:val="0"/>
+        </w:numPr>
+      </w:pPr>
+    </w:p>
+    <w:p>
+      <w:pPr>
+        <w:pStyle w:val="ListBullet"/>
+        <w:numPr>
+          <w:ilvl w:val="0"/>
+          <w:numId w:val="0"/>
+        </w:numPr>
+      </w:pPr>
+    </w:p>
+    <w:p>
+      <w:pPr>
+        <w:pStyle w:val="ListBullet"/>
+        <w:numPr>
+          <w:ilvl w:val="0"/>
+          <w:numId w:val="0"/>
+        </w:numPr>
+      </w:pPr>
+    </w:p>
+    <w:p>
+      <w:pPr>
+        <w:pStyle w:val="ListBullet"/>
+        <w:numPr>
+          <w:ilvl w:val="0"/>
+          <w:numId w:val="0"/>
+        </w:numPr>
+        <w:rPr>
+          <w:rFonts w:asciiTheme="majorHAnsi" w:hAnsiTheme="majorHAnsi"/>
+          <w:color w:val="156082" w:themeColor="accent1"/>
+          <w:sz w:val="40"/>
+          <w:szCs w:val="40"/>
+        </w:rPr>
+      </w:pPr>
+      <w:r>
+        <w:rPr>
+          <w:rFonts w:asciiTheme="majorHAnsi" w:hAnsiTheme="majorHAnsi"/>
+          <w:color w:val="156082" w:themeColor="accent1"/>
+          <w:sz w:val="40"/>
+          <w:szCs w:val="40"/>
+        </w:rPr>
+        <w:lastRenderedPageBreak/>
+        <w:t xml:space="preserve">11. </w:t>
+      </w:r>
+      <w:r>
+        <w:rPr>
+          <w:rFonts w:asciiTheme="majorHAnsi" w:hAnsiTheme="majorHAnsi"/>
+          <w:color w:val="156082" w:themeColor="accent1"/>
+          <w:sz w:val="40"/>
+          <w:szCs w:val="40"/>
+        </w:rPr>
+        <w:t>Tạo PDF hóa đơn</w:t>
+      </w:r>
+    </w:p>
+    <w:p>
+      <w:pPr>
+        <w:pStyle w:val="ListBullet"/>
+        <w:numPr>
+          <w:ilvl w:val="0"/>
+          <w:numId w:val="0"/>
+        </w:numPr>
+      </w:pPr>
+      <w:r>
+        <w:t>Dùng InvoicePdfMapper sau khi đã tính được InvoiceResponse:</w:t>
+      </w:r>
+    </w:p>
+    <w:p>
+      <w:pPr>
+        <w:pStyle w:val="ListBullet"/>
+        <w:numPr>
+          <w:ilvl w:val="0"/>
+          <w:numId w:val="0"/>
+        </w:numPr>
+        <w:rPr>
+          <w:rFonts w:ascii="Consolas" w:hAnsi="Consolas"/>
+          <w:color w:val="FFFFFF" w:themeColor="background1"/>
+          <w:sz w:val="18"/>
+          <w:szCs w:val="18"/>
+          <w:highlight w:val="black"/>
+        </w:rPr>
+      </w:pPr>
+      <w:r>
+        <w:rPr>
+          <w:rFonts w:ascii="Consolas" w:hAnsi="Consolas"/>
+          <w:color w:val="FFFFFF" w:themeColor="background1"/>
+          <w:sz w:val="18"/>
+          <w:szCs w:val="18"/>
+          <w:highlight w:val="black"/>
+        </w:rPr>
+        <w:t xml:space="preserve"> </w:t>
+      </w:r>
+      <w:r>
+        <w:rPr>
+          <w:rFonts w:ascii="Consolas" w:hAnsi="Consolas"/>
+          <w:color w:val="FFFFFF" w:themeColor="background1"/>
+          <w:sz w:val="18"/>
+          <w:szCs w:val="18"/>
+          <w:highlight w:val="black"/>
+        </w:rPr>
+        <w:t>import com.huydungktv.invoice.api.InvoicePdfResult;</w:t>
+      </w:r>
+    </w:p>
+    <w:p>
+      <w:pPr>
+        <w:pStyle w:val="ListBullet"/>
+        <w:numPr>
+          <w:ilvl w:val="0"/>
+          <w:numId w:val="0"/>
+        </w:numPr>
+        <w:rPr>
+          <w:rFonts w:ascii="Consolas" w:hAnsi="Consolas"/>
+          <w:color w:val="FFFFFF" w:themeColor="background1"/>
+          <w:sz w:val="18"/>
+          <w:szCs w:val="18"/>
+          <w:highlight w:val="black"/>
+        </w:rPr>
+      </w:pPr>
+      <w:r>
+        <w:rPr>
+          <w:rFonts w:ascii="Consolas" w:hAnsi="Consolas"/>
+          <w:color w:val="FFFFFF" w:themeColor="background1"/>
+          <w:sz w:val="18"/>
+          <w:szCs w:val="18"/>
+          <w:highlight w:val="black"/>
+        </w:rPr>
+        <w:t xml:space="preserve"> </w:t>
+      </w:r>
+      <w:r>
+        <w:rPr>
+          <w:rFonts w:ascii="Consolas" w:hAnsi="Consolas"/>
+          <w:color w:val="FFFFFF" w:themeColor="background1"/>
+          <w:sz w:val="18"/>
+          <w:szCs w:val="18"/>
+          <w:highlight w:val="black"/>
+        </w:rPr>
+        <w:t>import com.huydungktv.invoice.mapper.InvoicePdfMapper;</w:t>
+      </w:r>
+    </w:p>
+    <w:p>
+      <w:pPr>
+        <w:pStyle w:val="ListBullet"/>
+        <w:numPr>
+          <w:ilvl w:val="0"/>
+          <w:numId w:val="0"/>
+        </w:numPr>
+        <w:rPr>
+          <w:rFonts w:ascii="Consolas" w:hAnsi="Consolas"/>
+          <w:color w:val="FFFFFF" w:themeColor="background1"/>
+          <w:sz w:val="18"/>
+          <w:szCs w:val="18"/>
+          <w:highlight w:val="black"/>
+        </w:rPr>
+      </w:pPr>
+    </w:p>
+    <w:p>
+      <w:pPr>
+        <w:pStyle w:val="ListBullet"/>
+        <w:numPr>
+          <w:ilvl w:val="0"/>
+          <w:numId w:val="0"/>
+        </w:numPr>
+        <w:rPr>
+          <w:rFonts w:ascii="Consolas" w:hAnsi="Consolas"/>
+          <w:color w:val="FFFFFF" w:themeColor="background1"/>
+          <w:sz w:val="18"/>
+          <w:szCs w:val="18"/>
+          <w:highlight w:val="black"/>
+        </w:rPr>
+      </w:pPr>
+      <w:r>
+        <w:rPr>
+          <w:rFonts w:ascii="Consolas" w:hAnsi="Consolas"/>
+          <w:color w:val="FFFFFF" w:themeColor="background1"/>
+          <w:sz w:val="18"/>
+          <w:szCs w:val="18"/>
+          <w:highlight w:val="black"/>
+        </w:rPr>
+        <w:t xml:space="preserve"> </w:t>
+      </w:r>
+      <w:r>
+        <w:rPr>
+          <w:rFonts w:ascii="Consolas" w:hAnsi="Consolas"/>
+          <w:color w:val="FFFFFF" w:themeColor="background1"/>
+          <w:sz w:val="18"/>
+          <w:szCs w:val="18"/>
+          <w:highlight w:val="black"/>
+        </w:rPr>
+        <w:t>InvoicePdfResult pdfResult = new InvoicePdfMapper().toPdf(result);</w:t>
+      </w:r>
+    </w:p>
+    <w:p>
+      <w:pPr>
+        <w:pStyle w:val="ListBullet"/>
+        <w:numPr>
+          <w:ilvl w:val="0"/>
+          <w:numId w:val="0"/>
+        </w:numPr>
+        <w:rPr>
+          <w:rFonts w:ascii="Consolas" w:hAnsi="Consolas"/>
+          <w:color w:val="FFFFFF" w:themeColor="background1"/>
+          <w:sz w:val="18"/>
+          <w:szCs w:val="18"/>
+          <w:highlight w:val="black"/>
+        </w:rPr>
+      </w:pPr>
+      <w:r>
+        <w:rPr>
+          <w:rFonts w:ascii="Consolas" w:hAnsi="Consolas"/>
+          <w:color w:val="FFFFFF" w:themeColor="background1"/>
+          <w:sz w:val="18"/>
+          <w:szCs w:val="18"/>
+          <w:highlight w:val="black"/>
+        </w:rPr>
+        <w:t xml:space="preserve"> </w:t>
+      </w:r>
+      <w:r>
+        <w:rPr>
+          <w:rFonts w:ascii="Consolas" w:hAnsi="Consolas"/>
+          <w:color w:val="FFFFFF" w:themeColor="background1"/>
+          <w:sz w:val="18"/>
+          <w:szCs w:val="18"/>
+          <w:highlight w:val="black"/>
+        </w:rPr>
+        <w:t>String invoiceNumber = pdfResult.invoiceNumber();</w:t>
+      </w:r>
+    </w:p>
+    <w:p>
+      <w:pPr>
+        <w:pStyle w:val="ListBullet"/>
+        <w:numPr>
+          <w:ilvl w:val="0"/>
+          <w:numId w:val="0"/>
+        </w:numPr>
+        <w:rPr>
+          <w:rFonts w:ascii="Consolas" w:hAnsi="Consolas"/>
+          <w:color w:val="FFFFFF" w:themeColor="background1"/>
+          <w:sz w:val="18"/>
+          <w:szCs w:val="18"/>
+          <w:highlight w:val="black"/>
+        </w:rPr>
+      </w:pPr>
+    </w:p>
+    <w:p>
+      <w:pPr>
+        <w:pStyle w:val="ListBullet"/>
+        <w:numPr>
+          <w:ilvl w:val="0"/>
+          <w:numId w:val="0"/>
+        </w:numPr>
+        <w:rPr>
+          <w:rFonts w:ascii="Consolas" w:hAnsi="Consolas"/>
+          <w:color w:val="FFFFFF" w:themeColor="background1"/>
+          <w:sz w:val="18"/>
+          <w:szCs w:val="18"/>
+          <w:highlight w:val="black"/>
+        </w:rPr>
+      </w:pPr>
+      <w:r>
+        <w:rPr>
+          <w:rFonts w:ascii="Consolas" w:hAnsi="Consolas"/>
+          <w:color w:val="FFFFFF" w:themeColor="background1"/>
+          <w:sz w:val="18"/>
+          <w:szCs w:val="18"/>
+          <w:highlight w:val="black"/>
+        </w:rPr>
+        <w:t xml:space="preserve"> </w:t>
+      </w:r>
+      <w:r>
+        <w:rPr>
+          <w:rFonts w:ascii="Consolas" w:hAnsi="Consolas"/>
+          <w:color w:val="FFFFFF" w:themeColor="background1"/>
+          <w:sz w:val="18"/>
+          <w:szCs w:val="18"/>
+          <w:highlight w:val="black"/>
+        </w:rPr>
+        <w:t>Files.write(</w:t>
+      </w:r>
+    </w:p>
+    <w:p>
+      <w:pPr>
+        <w:pStyle w:val="ListBullet"/>
+        <w:numPr>
+          <w:ilvl w:val="0"/>
+          <w:numId w:val="0"/>
+        </w:numPr>
+        <w:rPr>
+          <w:rFonts w:ascii="Consolas" w:hAnsi="Consolas"/>
+          <w:color w:val="FFFFFF" w:themeColor="background1"/>
+          <w:sz w:val="18"/>
+          <w:szCs w:val="18"/>
+          <w:highlight w:val="black"/>
+        </w:rPr>
+      </w:pPr>
+      <w:r>
+        <w:rPr>
+          <w:rFonts w:ascii="Consolas" w:hAnsi="Consolas"/>
+          <w:color w:val="FFFFFF" w:themeColor="background1"/>
+          <w:sz w:val="18"/>
+          <w:szCs w:val="18"/>
+          <w:highlight w:val="black"/>
+        </w:rPr>
+        <w:tab/>
+        <w:t>Path.of("invoice-" + invoiceNumber + ".pdf"),</w:t>
+      </w:r>
+    </w:p>
+    <w:p>
+      <w:pPr>
+        <w:pStyle w:val="ListBullet"/>
+        <w:numPr>
+          <w:ilvl w:val="0"/>
+          <w:numId w:val="0"/>
+        </w:numPr>
+        <w:rPr>
+          <w:rFonts w:ascii="Consolas" w:hAnsi="Consolas"/>
+          <w:color w:val="FFFFFF" w:themeColor="background1"/>
+          <w:sz w:val="18"/>
+          <w:szCs w:val="18"/>
+          <w:highlight w:val="black"/>
+        </w:rPr>
+      </w:pPr>
+      <w:r>
+        <w:rPr>
+          <w:rFonts w:ascii="Consolas" w:hAnsi="Consolas"/>
+          <w:color w:val="FFFFFF" w:themeColor="background1"/>
+          <w:sz w:val="18"/>
+          <w:szCs w:val="18"/>
+          <w:highlight w:val="black"/>
+        </w:rPr>
+        <w:tab/>
+        <w:t>pdfResult.pdfBytes()</w:t>
+      </w:r>
+    </w:p>
+    <w:p>
+      <w:pPr>
+        <w:pStyle w:val="ListBullet"/>
+        <w:numPr>
+          <w:ilvl w:val="0"/>
+          <w:numId w:val="0"/>
+        </w:numPr>
+        <w:rPr>
+          <w:rFonts w:ascii="Consolas" w:hAnsi="Consolas"/>
+          <w:color w:val="FFFFFF" w:themeColor="background1"/>
+          <w:sz w:val="18"/>
+          <w:szCs w:val="18"/>
+        </w:rPr>
+      </w:pPr>
+      <w:r>
+        <w:rPr>
+          <w:rFonts w:ascii="Consolas" w:hAnsi="Consolas"/>
+          <w:color w:val="FFFFFF" w:themeColor="background1"/>
+          <w:sz w:val="18"/>
+          <w:szCs w:val="18"/>
+          <w:highlight w:val="black"/>
+        </w:rPr>
+        <w:t xml:space="preserve"> </w:t>
+      </w:r>
+      <w:r>
+        <w:rPr>
+          <w:rFonts w:ascii="Consolas" w:hAnsi="Consolas"/>
+          <w:color w:val="FFFFFF" w:themeColor="background1"/>
+          <w:sz w:val="18"/>
+          <w:szCs w:val="18"/>
+          <w:highlight w:val="black"/>
+        </w:rPr>
+        <w:t>);</w:t>
+      </w:r>
+    </w:p>
+    <w:p>
+      <w:pPr>
+        <w:pStyle w:val="ListBullet"/>
+        <w:numPr>
+          <w:ilvl w:val="0"/>
+          <w:numId w:val="0"/>
+        </w:numPr>
+      </w:pPr>
+      <w:r>
+        <w:t>Số hóa đơn có format yyyyMMdd.HHmmss, ví dụ 20260924.135145. API trả về bytes và số hóa đơn, còn việc lưu file thuộc về ứng dụng khách hàng.</w:t>
+      </w:r>
+    </w:p>
+    <w:p>
+      <w:pPr>
+        <w:pStyle w:val="ListBullet"/>
+        <w:numPr>
+          <w:ilvl w:val="0"/>
+          <w:numId w:val="0"/>
+        </w:numPr>
+      </w:pPr>
+      <w:r>
+        <w:t>PDF gồm tiêu đề, số hóa đơn, chi tiết từng item và tổng tiền trước VAT, tiền VAT, sau VAT. Font hiện tại hỗ trợ tập ký tự ASCII; ký tự có dấu trong tên item sẽ được thay bằng ?.</w:t>
+      </w:r>
+    </w:p>
+    <w:p>
+      <w:pPr>
+        <w:pStyle w:val="ListBullet"/>
+        <w:numPr>
+          <w:ilvl w:val="0"/>
+          <w:numId w:val="0"/>
+        </w:numPr>
+      </w:pPr>
+    </w:p>
+    <w:p>
+      <w:pPr>
         <w:pStyle w:val="Heading1"/>
       </w:pPr>
       <w:r>
-        <w:lastRenderedPageBreak/>
         <w:t>1</w:t>
       </w:r>
       <w:r>
-        <w:t>1</w:t>
+        <w:t>2</w:t>
       </w:r>
       <w:r>
         <w:t>. Kiểm thử và bàn giao</w:t>
@@ -3184,7 +3581,7 @@
         <w:t>1</w:t>
       </w:r>
       <w:r>
-        <w:t>2</w:t>
+        <w:t>3</w:t>
       </w:r>
       <w:r>
         <w:t>. Giới hạn hiện tại</w:t>
@@ -3203,15 +3600,21 @@
         <w:pStyle w:val="ListBullet"/>
       </w:pPr>
       <w:r>
-        <w:t>Chưa sinh mã hóa đơn.</w:t>
-      </w:r>
-    </w:p>
-    <w:p>
-      <w:pPr>
-        <w:pStyle w:val="ListBullet"/>
-      </w:pPr>
-      <w:r>
-        <w:t>Chưa xuất PDF hoặc XML.</w:t>
+        <w:t>Chưa sinh mã hóa đơn</w:t>
+      </w:r>
+      <w:r>
+        <w:t xml:space="preserve"> (ngoại trừ tạo pdf, mã hóa đơn lấy theo ngày giờ hiện tại)</w:t>
+      </w:r>
+      <w:r>
+        <w:t>.</w:t>
+      </w:r>
+    </w:p>
+    <w:p>
+      <w:pPr>
+        <w:pStyle w:val="ListBullet"/>
+      </w:pPr>
+      <w:r>
+        <w:t>Chưa xuất XML.</w:t>
       </w:r>
     </w:p>
     <w:p>

</xml_diff>

<commit_message>
Add Javadoc and invoice PDF fixtures
Add Javadoc comments to InvoiceCsvMapper, InvoicePdfMapper, DefaultInvoiceCalculator, InvoiceCalculator and InvoiceValidator to document behavior, parameters and error conditions. Add generated invoice PDF fixtures under src/test/java/com/huydungktv/invoice/invoicePdf. Update InvoiceLib_Handover_Guide.docx and remove temporary ~$voiceLib_Handover_Guide.docx. Changes are documentation and test assets only; no functional behavior intended to be altered.
</commit_message>
<xml_diff>
--- a/InvoiceLib_Handover_Guide.docx
+++ b/InvoiceLib_Handover_Guide.docx
@@ -3451,15 +3451,6 @@
     </w:p>
     <w:p>
       <w:pPr>
-        <w:pStyle w:val="ListBullet"/>
-        <w:numPr>
-          <w:ilvl w:val="0"/>
-          <w:numId w:val="0"/>
-        </w:numPr>
-      </w:pPr>
-    </w:p>
-    <w:p>
-      <w:pPr>
         <w:pStyle w:val="Heading1"/>
       </w:pPr>
       <w:r>
@@ -3653,11 +3644,6 @@
       <w:r>
         <w:t>Kết thúc tài liệu.</w:t>
       </w:r>
-    </w:p>
-    <w:p>
-      <w:pPr>
-        <w:jc w:val="center"/>
-      </w:pPr>
     </w:p>
     <w:sectPr>
       <w:pgSz w:w="12240" w:h="15840"/>

</xml_diff>